<commit_message>
docs: registrar el despliegue del servicio y ajustar el requisito de disponibilidad
Se documenta la publicacion del servicio en la plataforma de despliegue: nombre, directorio raiz, comando de arranque, comprobacion de salud, variables de entorno y despliegue automatico. Se registran dos hallazgos: la clave del modulo de adquisicion conservaba el valor de ejemplo publicado en el repositorio, que se reemplazo por una clave aleatoria; y la capa gratuita de la plataforma admite hasta cincuenta segundos de espera al despertar, de modo que el requisito RNF-05 pasa a sesenta segundos y el tiempo maximo de espera del cliente a sesenta.
</commit_message>
<xml_diff>
--- a/docs/BITACORA_MARTES_2026-09-15.docx
+++ b/docs/BITACORA_MARTES_2026-09-15.docx
@@ -5293,6 +5293,478 @@
         <w:t>Confirmar en el repositorio los archivos nuevos: el tablero, el entregable E1 y las figuras generadas.</w:t>
       </w:r>
     </w:p>
+    <w:p>
+      <w:r>
+        <w:rPr>
+          <w:b w:val="0"/>
+          <w:color w:val="555555"/>
+          <w:sz w:val="18"/>
+        </w:rPr>
+        <w:t>____________________________________________________________</w:t>
+      </w:r>
+    </w:p>
+    <w:p>
+      <w:pPr>
+        <w:pStyle w:val="Title"/>
+      </w:pPr>
+      <w:r>
+        <w:t>Tercera parte — miércoles 16: despliegue del servicio</w:t>
+      </w:r>
+    </w:p>
+    <w:p>
+      <w:pPr>
+        <w:pStyle w:val="Heading1"/>
+      </w:pPr>
+      <w:r>
+        <w:t>23. Publicación del servicio en la plataforma</w:t>
+      </w:r>
+    </w:p>
+    <w:p>
+      <w:r>
+        <w:rPr>
+          <w:b w:val="0"/>
+          <w:sz w:val="22"/>
+        </w:rPr>
+        <w:t>El servicio quedó desplegado en Render, en su capa gratuita, con la definición declarada en el repositorio (render.yaml) y creado a partir del repositorio de GitHub.</w:t>
+      </w:r>
+    </w:p>
+    <w:tbl>
+      <w:tblPr>
+        <w:tblStyle w:val="TableGrid"/>
+        <w:tblW w:type="auto" w:w="0"/>
+        <w:jc w:val="center"/>
+        <w:tblLook w:firstColumn="1" w:firstRow="1" w:lastColumn="0" w:lastRow="0" w:noHBand="0" w:noVBand="1" w:val="04A0"/>
+      </w:tblPr>
+      <w:tblGrid>
+        <w:gridCol w:w="4320"/>
+        <w:gridCol w:w="4320"/>
+      </w:tblGrid>
+      <w:tr>
+        <w:tc>
+          <w:tcPr>
+            <w:tcW w:type="dxa" w:w="4320"/>
+          </w:tcPr>
+          <w:p>
+            <w:r>
+              <w:rPr>
+                <w:b/>
+                <w:sz w:val="20"/>
+              </w:rPr>
+              <w:t>Elemento</w:t>
+            </w:r>
+          </w:p>
+        </w:tc>
+        <w:tc>
+          <w:tcPr>
+            <w:tcW w:type="dxa" w:w="4320"/>
+          </w:tcPr>
+          <w:p>
+            <w:r>
+              <w:rPr>
+                <w:b/>
+                <w:sz w:val="20"/>
+              </w:rPr>
+              <w:t>Valor</w:t>
+            </w:r>
+          </w:p>
+        </w:tc>
+      </w:tr>
+      <w:tr>
+        <w:tc>
+          <w:tcPr>
+            <w:tcW w:type="dxa" w:w="4320"/>
+          </w:tcPr>
+          <w:p>
+            <w:r>
+              <w:rPr>
+                <w:b w:val="0"/>
+                <w:sz w:val="20"/>
+              </w:rPr>
+              <w:t>Nombre del servicio</w:t>
+            </w:r>
+          </w:p>
+        </w:tc>
+        <w:tc>
+          <w:tcPr>
+            <w:tcW w:type="dxa" w:w="4320"/>
+          </w:tcPr>
+          <w:p>
+            <w:r>
+              <w:rPr>
+                <w:b w:val="0"/>
+                <w:sz w:val="20"/>
+              </w:rPr>
+              <w:t>sigvach-api</w:t>
+            </w:r>
+          </w:p>
+        </w:tc>
+      </w:tr>
+      <w:tr>
+        <w:tc>
+          <w:tcPr>
+            <w:tcW w:type="dxa" w:w="4320"/>
+          </w:tcPr>
+          <w:p>
+            <w:r>
+              <w:rPr>
+                <w:b w:val="0"/>
+                <w:sz w:val="20"/>
+              </w:rPr>
+              <w:t>Repositorio y rama</w:t>
+            </w:r>
+          </w:p>
+        </w:tc>
+        <w:tc>
+          <w:tcPr>
+            <w:tcW w:type="dxa" w:w="4320"/>
+          </w:tcPr>
+          <w:p>
+            <w:r>
+              <w:rPr>
+                <w:b w:val="0"/>
+                <w:sz w:val="20"/>
+              </w:rPr>
+              <w:t>saintssud-sud/Proyecto---Diplomado · main</w:t>
+            </w:r>
+          </w:p>
+        </w:tc>
+      </w:tr>
+      <w:tr>
+        <w:tc>
+          <w:tcPr>
+            <w:tcW w:type="dxa" w:w="4320"/>
+          </w:tcPr>
+          <w:p>
+            <w:r>
+              <w:rPr>
+                <w:b w:val="0"/>
+                <w:sz w:val="20"/>
+              </w:rPr>
+              <w:t>Directorio raíz</w:t>
+            </w:r>
+          </w:p>
+        </w:tc>
+        <w:tc>
+          <w:tcPr>
+            <w:tcW w:type="dxa" w:w="4320"/>
+          </w:tcPr>
+          <w:p>
+            <w:r>
+              <w:rPr>
+                <w:b w:val="0"/>
+                <w:sz w:val="20"/>
+              </w:rPr>
+              <w:t>backend</w:t>
+            </w:r>
+          </w:p>
+        </w:tc>
+      </w:tr>
+      <w:tr>
+        <w:tc>
+          <w:tcPr>
+            <w:tcW w:type="dxa" w:w="4320"/>
+          </w:tcPr>
+          <w:p>
+            <w:r>
+              <w:rPr>
+                <w:b w:val="0"/>
+                <w:sz w:val="20"/>
+              </w:rPr>
+              <w:t>Construcción</w:t>
+            </w:r>
+          </w:p>
+        </w:tc>
+        <w:tc>
+          <w:tcPr>
+            <w:tcW w:type="dxa" w:w="4320"/>
+          </w:tcPr>
+          <w:p>
+            <w:r>
+              <w:rPr>
+                <w:b w:val="0"/>
+                <w:sz w:val="20"/>
+              </w:rPr>
+              <w:t>pip install -r requirements.txt</w:t>
+            </w:r>
+          </w:p>
+        </w:tc>
+      </w:tr>
+      <w:tr>
+        <w:tc>
+          <w:tcPr>
+            <w:tcW w:type="dxa" w:w="4320"/>
+          </w:tcPr>
+          <w:p>
+            <w:r>
+              <w:rPr>
+                <w:b w:val="0"/>
+                <w:sz w:val="20"/>
+              </w:rPr>
+              <w:t>Arranque</w:t>
+            </w:r>
+          </w:p>
+        </w:tc>
+        <w:tc>
+          <w:tcPr>
+            <w:tcW w:type="dxa" w:w="4320"/>
+          </w:tcPr>
+          <w:p>
+            <w:r>
+              <w:rPr>
+                <w:b w:val="0"/>
+                <w:sz w:val="20"/>
+              </w:rPr>
+              <w:t>uvicorn app.main:app --host 0.0.0.0 --port $PORT --proxy-headers --forwarded-allow-ips="*"</w:t>
+            </w:r>
+          </w:p>
+        </w:tc>
+      </w:tr>
+      <w:tr>
+        <w:tc>
+          <w:tcPr>
+            <w:tcW w:type="dxa" w:w="4320"/>
+          </w:tcPr>
+          <w:p>
+            <w:r>
+              <w:rPr>
+                <w:b w:val="0"/>
+                <w:sz w:val="20"/>
+              </w:rPr>
+              <w:t>Comprobación de salud</w:t>
+            </w:r>
+          </w:p>
+        </w:tc>
+        <w:tc>
+          <w:tcPr>
+            <w:tcW w:type="dxa" w:w="4320"/>
+          </w:tcPr>
+          <w:p>
+            <w:r>
+              <w:rPr>
+                <w:b w:val="0"/>
+                <w:sz w:val="20"/>
+              </w:rPr>
+              <w:t>/api/v1/salud</w:t>
+            </w:r>
+          </w:p>
+        </w:tc>
+      </w:tr>
+      <w:tr>
+        <w:tc>
+          <w:tcPr>
+            <w:tcW w:type="dxa" w:w="4320"/>
+          </w:tcPr>
+          <w:p>
+            <w:r>
+              <w:rPr>
+                <w:b w:val="0"/>
+                <w:sz w:val="20"/>
+              </w:rPr>
+              <w:t>Tipo de instancia</w:t>
+            </w:r>
+          </w:p>
+        </w:tc>
+        <w:tc>
+          <w:tcPr>
+            <w:tcW w:type="dxa" w:w="4320"/>
+          </w:tcPr>
+          <w:p>
+            <w:r>
+              <w:rPr>
+                <w:b w:val="0"/>
+                <w:sz w:val="20"/>
+              </w:rPr>
+              <w:t>Gratuita</w:t>
+            </w:r>
+          </w:p>
+        </w:tc>
+      </w:tr>
+      <w:tr>
+        <w:tc>
+          <w:tcPr>
+            <w:tcW w:type="dxa" w:w="4320"/>
+          </w:tcPr>
+          <w:p>
+            <w:r>
+              <w:rPr>
+                <w:b w:val="0"/>
+                <w:sz w:val="20"/>
+              </w:rPr>
+              <w:t>Variables de entorno</w:t>
+            </w:r>
+          </w:p>
+        </w:tc>
+        <w:tc>
+          <w:tcPr>
+            <w:tcW w:type="dxa" w:w="4320"/>
+          </w:tcPr>
+          <w:p>
+            <w:r>
+              <w:rPr>
+                <w:b w:val="0"/>
+                <w:sz w:val="20"/>
+              </w:rPr>
+              <w:t>ENTORNO, FIREBASE_PROJECT_ID, ALLOWED_ORIGINS, DEVICE_API_KEY y FIREBASE_SERVICE_ACCOUNT_JSON</w:t>
+            </w:r>
+          </w:p>
+        </w:tc>
+      </w:tr>
+      <w:tr>
+        <w:tc>
+          <w:tcPr>
+            <w:tcW w:type="dxa" w:w="4320"/>
+          </w:tcPr>
+          <w:p>
+            <w:r>
+              <w:rPr>
+                <w:b w:val="0"/>
+                <w:sz w:val="20"/>
+              </w:rPr>
+              <w:t>Despliegue automático</w:t>
+            </w:r>
+          </w:p>
+        </w:tc>
+        <w:tc>
+          <w:tcPr>
+            <w:tcW w:type="dxa" w:w="4320"/>
+          </w:tcPr>
+          <w:p>
+            <w:r>
+              <w:rPr>
+                <w:b w:val="0"/>
+                <w:sz w:val="20"/>
+              </w:rPr>
+              <w:t>Al confirmar cambios en el repositorio</w:t>
+            </w:r>
+          </w:p>
+        </w:tc>
+      </w:tr>
+    </w:tbl>
+    <w:p/>
+    <w:p>
+      <w:r>
+        <w:rPr>
+          <w:b w:val="0"/>
+          <w:sz w:val="22"/>
+        </w:rPr>
+        <w:t>Decisiones tomadas durante la publicación.</w:t>
+      </w:r>
+    </w:p>
+    <w:p>
+      <w:pPr>
+        <w:pStyle w:val="ListBullet"/>
+      </w:pPr>
+      <w:r>
+        <w:rPr>
+          <w:b w:val="0"/>
+          <w:sz w:val="22"/>
+        </w:rPr>
+        <w:t>Se eligió el nombre sigvach-api para que la dirección pública sea legible y citable en la monografía.</w:t>
+      </w:r>
+    </w:p>
+    <w:p>
+      <w:pPr>
+        <w:pStyle w:val="ListBullet"/>
+      </w:pPr>
+      <w:r>
+        <w:rPr>
+          <w:b w:val="0"/>
+          <w:sz w:val="22"/>
+        </w:rPr>
+        <w:t>El directorio raíz se fijó en backend porque el servicio y sus dependencias viven en esa carpeta: sin esa indicación la construcción falla.</w:t>
+      </w:r>
+    </w:p>
+    <w:p>
+      <w:pPr>
+        <w:pStyle w:val="ListBullet"/>
+      </w:pPr>
+      <w:r>
+        <w:rPr>
+          <w:b w:val="0"/>
+          <w:sz w:val="22"/>
+        </w:rPr>
+        <w:t>El comando de arranque obliga a escuchar en 0.0.0.0 y en el puerto que asigna la plataforma ($PORT), y a confiar en las cabeceras del proxy (--proxy-headers), condición para funcionar detrás del terminador TLS de la plataforma.</w:t>
+      </w:r>
+    </w:p>
+    <w:p>
+      <w:pPr>
+        <w:pStyle w:val="ListBullet"/>
+      </w:pPr>
+      <w:r>
+        <w:rPr>
+          <w:b w:val="0"/>
+          <w:sz w:val="22"/>
+        </w:rPr>
+        <w:t>Los secretos se declararon como variables de entorno en el panel y no como archivos: la clave de la cuenta de servicio se cargó en una sola línea JSON (2330 caracteres) y la clave del módulo de adquisición con su valor vigente.</w:t>
+      </w:r>
+    </w:p>
+    <w:p>
+      <w:pPr>
+        <w:pStyle w:val="ListBullet"/>
+      </w:pPr>
+      <w:r>
+        <w:rPr>
+          <w:b w:val="0"/>
+          <w:sz w:val="22"/>
+        </w:rPr>
+        <w:t>Se concedió a la plataforma acceso solo al repositorio del proyecto, según el criterio de mínimo privilegio.</w:t>
+      </w:r>
+    </w:p>
+    <w:p>
+      <w:r>
+        <w:rPr>
+          <w:b w:val="0"/>
+          <w:sz w:val="22"/>
+        </w:rPr>
+        <w:t>Hallazgo de seguridad. Al revisar la configuración se detectó que el archivo de entorno local conservaba el valor de ejemplo de la clave del módulo de adquisición (cambiar-por-una-cadena-aleatoria-larga), que está publicado en la plantilla del repositorio: cualquier persona que accediera al repositorio podía enviar lecturas al servicio. Se generó una clave aleatoria de 64 caracteres con secrets.token_urlsafe, se actualizó el archivo de entorno local y la configuración del despliegue, y se conservó un respaldo del archivo anterior. La comprobación inicial no lo detectó porque solo medía la longitud del valor, que coincidía con la de una clave real.</w:t>
+      </w:r>
+    </w:p>
+    <w:p>
+      <w:r>
+        <w:rPr>
+          <w:b w:val="0"/>
+          <w:sz w:val="22"/>
+        </w:rPr>
+        <w:t>Hallazgo de disponibilidad. La plataforma advierte que, en su capa gratuita, la instancia se suspende por inactividad y que la primera petición posterior puede demorar cincuenta segundos o más. El requisito RNF-05 declaraba treinta segundos, de modo que se corrigió a sesenta segundos —en la monografía y en el entregable E1— y el tiempo máximo de espera del cliente se elevó de 45 a 60 segundos, para que esa primera petición no se interprete como un fallo de conexión.</w:t>
+      </w:r>
+    </w:p>
+    <w:p>
+      <w:r>
+        <w:rPr>
+          <w:b w:val="0"/>
+          <w:sz w:val="22"/>
+        </w:rPr>
+        <w:t>Archivos de apoyo generados. Se prepararon dos utilidades reproducibles: una que convierte la clave de la cuenta de servicio en una sola línea y comprueba que sirve para autenticar, y otra que reúne las cinco variables de entorno en un archivo para cargarlas de una vez en la plataforma. Ese archivo contiene secretos, se guardó fuera del repositorio y se elimina una vez cargado.</w:t>
+      </w:r>
+    </w:p>
+    <w:p>
+      <w:r>
+        <w:rPr>
+          <w:b w:val="0"/>
+          <w:sz w:val="22"/>
+        </w:rPr>
+        <w:t>Pendiente de esta fase. Publicar la aplicación web en Firebase Hosting con la dirección del servicio, cerrar los orígenes permitidos (CORS) con la dirección pública de la aplicación, publicar las reglas de seguridad de Firestore y generar el archivo instalable de Android. Se recomienda además rotar la clave de la cuenta de servicio, porque una captura de pantalla mostró su encabezado durante la configuración.</w:t>
+      </w:r>
+    </w:p>
+    <w:p>
+      <w:r>
+        <w:rPr>
+          <w:b w:val="0"/>
+          <w:color w:val="555555"/>
+          <w:sz w:val="18"/>
+        </w:rPr>
+        <w:t>____________________________________________________________</w:t>
+      </w:r>
+    </w:p>
+    <w:p>
+      <w:r>
+        <w:rPr>
+          <w:b w:val="0"/>
+          <w:sz w:val="22"/>
+        </w:rPr>
+        <w:t>Bitácora de trabajo del Módulo 4. Elaborada al cierre de las sesiones del lunes 14, del martes 15 y del miércoles 16 de septiembre de 2026.</w:t>
+      </w:r>
+    </w:p>
     <w:sectPr>
       <w:pgSz w:w="12240" w:h="15840"/>
       <w:pgMar w:top="1440" w:right="1800" w:bottom="1440" w:left="1800" w:header="720" w:footer="720" w:gutter="0"/>

</xml_diff>

<commit_message>
docs(bitacora): registrar la publicacion de la aplicacion web y las reglas de seguridad
Se documenta la publicacion de la aplicacion web en Firebase Hosting con su opcion en el panel de control, el hallazgo del proyecto equivocado en la configuracion del servicio y el hallazgo de interfaz del estado vacio, que no ofrecia salida hacia otro modulo. Se registra tambien la verificacion previa a publicar las reglas de seguridad y el estado del despliegue.
</commit_message>
<xml_diff>
--- a/docs/BITACORA_MARTES_2026-09-15.docx
+++ b/docs/BITACORA_MARTES_2026-09-15.docx
@@ -5757,12 +5757,84 @@
       </w:r>
     </w:p>
     <w:p>
+      <w:pPr>
+        <w:pStyle w:val="Heading1"/>
+      </w:pPr>
+      <w:r>
+        <w:t>24. Jueves 17: publicación de la aplicación web y cierre de la seguridad</w:t>
+      </w:r>
+    </w:p>
+    <w:p>
       <w:r>
         <w:rPr>
           <w:b w:val="0"/>
           <w:sz w:val="22"/>
         </w:rPr>
-        <w:t>Bitácora de trabajo del Módulo 4. Elaborada al cierre de las sesiones del lunes 14, del martes 15 y del miércoles 16 de septiembre de 2026.</w:t>
+        <w:t>Publicación de la aplicación web. Se compiló la aplicación apuntando al servicio publicado y se publicó en Firebase Hosting, con el agregado de una opción al panel de control que realiza los dos pasos —compilar y publicar— sin escribir comandos. La aplicación quedó accesible en https://sigvach26-bd.web.app y consume el servicio de la nube, de modo que el sistema completo funciona sin depender del equipo del autor. Los orígenes permitidos quedaron verificados sin intervención adicional: si la aplicación publicada lee datos del servicio, el navegador no está bloqueando las peticiones.</w:t>
+      </w:r>
+    </w:p>
+    <w:p>
+      <w:r>
+        <w:rPr>
+          <w:b w:val="0"/>
+          <w:sz w:val="22"/>
+        </w:rPr>
+        <w:t>Hallazgo: el servicio buscaba la base de datos en otro proyecto. La comprobación de salud del servicio desplegado informaba degradado con la base como no disponible, mientras que el servicio local conectaba sin inconvenientes con las mismas credenciales. El registro del servicio permitió identificar la causa con precisión: la consulta se dirigía al proyecto production en lugar de sigvach26-bd, y Google respondía 403 Cloud Firestore API has not been used in project production. Corregida la variable de configuración del proyecto, la comprobación de salud pasó a informar ok con la base conectada.</w:t>
+      </w:r>
+    </w:p>
+    <w:p>
+      <w:r>
+        <w:rPr>
+          <w:b w:val="0"/>
+          <w:sz w:val="22"/>
+        </w:rPr>
+        <w:t>&gt; Este caso dejó dos enseñanzas que se incorporaron al sistema. La primera es de diagnóstico: el repositorio de Firestore atrapaba cualquier fallo y devolvía «no disponible» sin dejar constancia de la causa, de modo que una credencial ausente, un proyecto equivocado y un problema de permisos producían el mismo síntoma. Ahora la excepción se registra con su tipo y su mensaje, y al arrancar se informa el proyecto y la cuenta de servicio con los que quedó vinculado el SDK. La segunda es de método: comparar el comportamiento local con el desplegado permitió descartar en un paso las credenciales —que funcionaban— y concentrar la búsqueda en la configuración del entorno.</w:t>
+      </w:r>
+    </w:p>
+    <w:p>
+      <w:r>
+        <w:rPr>
+          <w:b w:val="0"/>
+          <w:sz w:val="22"/>
+        </w:rPr>
+        <w:t>Hallazgo de interfaz: el estado vacío no ofrecía salida. Al probar la aplicación publicada, el panel mostró el estado vacío del módulo recién creado —que todavía no tiene lecturas— y en ese estado no presentaba el selector de módulo ni la acción de registrar una medición: el usuario quedaba viendo un aviso sin forma de llegar al módulo que sí tiene datos. Se corrigió el componente de estados para que admita un contenido propio del estado vacío, y el panel ahora ofrece allí el encabezado con el selector de módulo y la acción de actualizar.</w:t>
+      </w:r>
+    </w:p>
+    <w:p>
+      <w:r>
+        <w:rPr>
+          <w:b w:val="0"/>
+          <w:sz w:val="22"/>
+        </w:rPr>
+        <w:t>Reglas de seguridad publicadas. Antes de publicarlas se verificó que ningún componente del cliente acceda a las colecciones del dominio: la aplicación solo lee y escribe la colección usuarios —el perfil propio y, para el administrador, el resto— y todo el dominio pasa por el servicio. Se comprobó además que el correo del administrador declarado en las reglas coincide con el que asigna la aplicación (admin@sigvach.com) y que las colecciones heredadas del proyecto del aula (registros y firestore_demo) corresponden a código sin uso, de modo que cerrarlas no afecta ninguna pantalla.</w:t>
+      </w:r>
+    </w:p>
+    <w:p>
+      <w:r>
+        <w:rPr>
+          <w:b w:val="0"/>
+          <w:sz w:val="22"/>
+        </w:rPr>
+        <w:t>Estado del despliegue. Servicio en la nube (Live), documentación de la API publicada, aplicación web publicada, reglas de seguridad publicadas y comprobación de salud en ok con la base conectada. Queda pendiente generar el archivo instalable de Android y reunir las evidencias de los ocho requisitos mínimos.</w:t>
+      </w:r>
+    </w:p>
+    <w:p>
+      <w:r>
+        <w:rPr>
+          <w:b w:val="0"/>
+          <w:color w:val="555555"/>
+          <w:sz w:val="18"/>
+        </w:rPr>
+        <w:t>____________________________________________________________</w:t>
+      </w:r>
+    </w:p>
+    <w:p>
+      <w:r>
+        <w:rPr>
+          <w:b w:val="0"/>
+          <w:sz w:val="22"/>
+        </w:rPr>
+        <w:t>Bitácora de trabajo del Módulo 4. Elaborada al cierre de las sesiones del lunes 14, del martes 15, del miércoles 16 y del jueves 17 de septiembre de 2026.</w:t>
       </w:r>
     </w:p>
     <w:sectPr>

</xml_diff>

<commit_message>
docs(bitacora): registrar los hallazgos de interfaz encontrados al probar la aplicacion
</commit_message>
<xml_diff>
--- a/docs/BITACORA_MARTES_2026-09-15.docx
+++ b/docs/BITACORA_MARTES_2026-09-15.docx
@@ -5797,7 +5797,34 @@
           <w:b w:val="0"/>
           <w:sz w:val="22"/>
         </w:rPr>
-        <w:t>Hallazgo de interfaz: el estado vacío no ofrecía salida. Al probar la aplicación publicada, el panel mostró el estado vacío del módulo recién creado —que todavía no tiene lecturas— y en ese estado no presentaba el selector de módulo ni la acción de registrar una medición: el usuario quedaba viendo un aviso sin forma de llegar al módulo que sí tiene datos. Se corrigió el componente de estados para que admita un contenido propio del estado vacío, y el panel ahora ofrece allí el encabezado con el selector de módulo y la acción de actualizar.</w:t>
+        <w:t>Hallazgo de interfaz: el estado vacío no ofrecía salida. Al probar la aplicación publicada, el panel mostró el estado vacío del módulo recién creado —que todavía no tiene lecturas— y, en ese estado, no presentaba el selector de módulo ni la acción de registrar una medición: el usuario quedaba viendo un aviso sin forma de llegar al módulo que sí tiene datos. Se corrigió el componente de estados para que admita un contenido propio del estado vacío, y el panel ahora ofrece allí el encabezado con el selector de módulo y la acción de actualizar.</w:t>
+      </w:r>
+    </w:p>
+    <w:p>
+      <w:r>
+        <w:rPr>
+          <w:b w:val="0"/>
+          <w:sz w:val="22"/>
+        </w:rPr>
+        <w:t>Hallazgo de interfaz: el módulo nuevo no aparecía en el panel. Al registrar un módulo desde la pantalla de módulos, la lista del panel de inicio no se actualizaba: cada controlador conserva la suya, de modo que el módulo recién creado solo aparecía en el selector del panel después de reiniciar la aplicación. Se incorporó un aviso al panel después de cada operación sobre módulos —registrar, modificar y eliminar—, conservando el módulo vigente cuando sigue existiendo.</w:t>
+      </w:r>
+    </w:p>
+    <w:p>
+      <w:r>
+        <w:rPr>
+          <w:b w:val="0"/>
+          <w:sz w:val="22"/>
+        </w:rPr>
+        <w:t>Hallazgo de interfaz: un módulo nuevo no podía recibir su primera medición. El razonamiento del autor durante la prueba fue el que permitió encontrarlo: si un módulo recién creado no tiene lecturas, el panel muestra su estado vacío; y la acción de registrar una medición existía únicamente en el estado con datos. El resultado era que un módulo nuevo no podía poblarse nunca desde la aplicación: quedaba vacío de forma permanente y daba la impresión de que crear módulos no aportaba nada. El estado vacío ofrece ahora la acción de registrar la primera medición, además del selector de módulo y la recarga.</w:t>
+      </w:r>
+    </w:p>
+    <w:p>
+      <w:r>
+        <w:rPr>
+          <w:b w:val="0"/>
+          <w:sz w:val="22"/>
+        </w:rPr>
+        <w:t>&gt; Los tres hallazgos anteriores provienen de usar la aplicación publicada, no de revisar el código: crear un módulo, verlo en el panel y registrar sus mediciones son las operaciones que un usuario real hace en los primeros minutos. Quedan como ejemplo de por qué la prueba en el entorno desplegado —y no solo en el equipo de desarrollo— forma parte del trabajo de construcción.</w:t>
       </w:r>
     </w:p>
     <w:p>

</xml_diff>

<commit_message>
feat(app): permitir elegir el cultivo en la pantalla de rangos de referencia
Los rangos pertenecen a un cultivo, pero la pantalla los listaba todos juntos: como solo el cultivo predefinido tenia rangos cargados, parecia que el sistema admitia un unico cultivo, y no habia forma de ver ni de advertir que un cultivo recien creado no tiene rangos, de modo que sus lecturas no se evaluan ni generan alertas. Se agrega el selector de cultivo, el filtro de la lista y un aviso que indica donde se definen los rangos de un cultivo sin ellos. Se registran ademas en la bitacora los hallazgos de interfaz y de coherencia de esta jornada.
</commit_message>
<xml_diff>
--- a/docs/BITACORA_MARTES_2026-09-15.docx
+++ b/docs/BITACORA_MARTES_2026-09-15.docx
@@ -5815,6 +5815,24 @@
           <w:b w:val="0"/>
           <w:sz w:val="22"/>
         </w:rPr>
+        <w:t>Hallazgo de interfaz: la pantalla de rangos no dejaba elegir el cultivo. Los rangos de referencia pertenecen a un cultivo, pero la pantalla los listaba todos juntos. Como solo el cultivo predefinido tenía rangos cargados, la pantalla parecía indicar que el sistema admitía un único cultivo, y no había forma de ver —ni de advertir— que un cultivo recién creado no tiene rangos: sus lecturas no se evalúan y no generan alertas, que es justamente lo que el usuario observaba sin explicación. Se incorporó el selector de cultivo, el filtro de la lista por cultivo y un aviso que indica, para el cultivo sin rangos, dónde se definen.</w:t>
+      </w:r>
+    </w:p>
+    <w:p>
+      <w:r>
+        <w:rPr>
+          <w:b w:val="0"/>
+          <w:sz w:val="22"/>
+        </w:rPr>
+        <w:t>Hallazgo de coherencia: alertas e historial no estaban acotados al módulo. El panel y la pantalla de variables trabajan sobre el módulo vigente, pero las pantallas de alertas y de historial consultaban el servicio sin filtrar por módulo, de modo que mezclaban datos de módulos con cultivos y rangos distintos —y el resumen del periodo no correspondía a ningún módulo en particular—. Se acotaron ambas consultas al módulo vigente, se rehacen si el usuario cambia de módulo, y las cuatro pantallas muestran ahora el mismo detalle del módulo mediante un componente compartido.</w:t>
+      </w:r>
+    </w:p>
+    <w:p>
+      <w:r>
+        <w:rPr>
+          <w:b w:val="0"/>
+          <w:sz w:val="22"/>
+        </w:rPr>
         <w:t>Hallazgo de interfaz: un módulo nuevo no podía recibir su primera medición. El razonamiento del autor durante la prueba fue el que permitió encontrarlo: si un módulo recién creado no tiene lecturas, el panel muestra su estado vacío; y la acción de registrar una medición existía únicamente en el estado con datos. El resultado era que un módulo nuevo no podía poblarse nunca desde la aplicación: quedaba vacío de forma permanente y daba la impresión de que crear módulos no aportaba nada. El estado vacío ofrece ahora la acción de registrar la primera medición, además del selector de módulo y la recarga.</w:t>
       </w:r>
     </w:p>

</xml_diff>

<commit_message>
docs(bitacora): dejar constancia de la validacion de los datos del contexto
Los tres puntos criticos y su tabla de contexto se sometieron a quien realizo el seguimiento previo del cultivo, que es la fuente citada, y confirmo que describen lo que efectivamente se hacia. La constancia importa porque esos datos no provienen de una medicion propia: se validaron con la fuente antes de sostenerlos en el documento.
</commit_message>
<xml_diff>
--- a/docs/BITACORA_MARTES_2026-09-15.docx
+++ b/docs/BITACORA_MARTES_2026-09-15.docx
@@ -5878,6 +5878,15 @@
           <w:b w:val="0"/>
           <w:sz w:val="22"/>
         </w:rPr>
+        <w:t>Validación de los datos del contexto. Los tres puntos críticos del apartado 1.2 —registro manual y esporádico, ausencia de trazabilidad de la medición y detección tardía de los valores fuera de rango— y la tabla que los respalda se sometieron a quien realizó el seguimiento previo del cultivo, que es la fuente citada, y confirmó que describen lo que efectivamente se hacía. La constancia importa porque esos datos no provienen de una medición propia: se redactaron como hechos observables del proceso, sin cifras que no pudieran respaldarse, y se validaron con la fuente antes de sostenerlos en el documento. Con esta validación, el entregable queda sin datos del contexto pendientes de confirmar.</w:t>
+      </w:r>
+    </w:p>
+    <w:p>
+      <w:r>
+        <w:rPr>
+          <w:b w:val="0"/>
+          <w:sz w:val="22"/>
+        </w:rPr>
         <w:t>Estado del despliegue. Servicio en la nube (Live), documentación de la API publicada, aplicación web publicada, reglas de seguridad publicadas y comprobación de salud en ok con la base conectada. Queda pendiente generar el archivo instalable de Android y reunir las evidencias de los ocho requisitos mínimos.</w:t>
       </w:r>
     </w:p>

</xml_diff>

<commit_message>
docs(bitacora): registrar la aclaracion sobre monolito, monolito modular y capas
Se documenta la duda resuelta durante la revision del documento: las listas de patrones mezclan dos ejes distintos —el despliegue y la organizacion interna— y por eso parecen alternativas excluyentes. Se explica que monolito responde al primero y modular al segundo, que todo monolito modular es un monolito pero no al reves, como se aplica al sistema —despliegue monolitico modular y organizacion en capas—, que alternativas se evaluaron y descartaron, la precision entre servicio y sistema, la analogia adoptada para explicarlo y la redaccion que se incorporo al documento.
</commit_message>
<xml_diff>
--- a/docs/BITACORA_MARTES_2026-09-15.docx
+++ b/docs/BITACORA_MARTES_2026-09-15.docx
@@ -5901,12 +5901,284 @@
       </w:r>
     </w:p>
     <w:p>
+      <w:pPr>
+        <w:pStyle w:val="Heading1"/>
+      </w:pPr>
+      <w:r>
+        <w:t>25. Aclaración conceptual: monolito, monolito modular y arquitectura en capas</w:t>
+      </w:r>
+    </w:p>
+    <w:p>
       <w:r>
         <w:rPr>
           <w:b w:val="0"/>
           <w:sz w:val="22"/>
         </w:rPr>
-        <w:t>Bitácora de trabajo del Módulo 4. Elaborada al cierre de las sesiones del lunes 14, del martes 15, del miércoles 16 y del jueves 17 de septiembre de 2026.</w:t>
+        <w:t>Esta sección no registra una tarea hecha sino una duda resuelta durante la revisión del documento, que conviene conservar porque el concepto se evalúa en la defensa y porque explica una decisión ya tomada.</w:t>
+      </w:r>
+    </w:p>
+    <w:p>
+      <w:r>
+        <w:rPr>
+          <w:b w:val="0"/>
+          <w:sz w:val="22"/>
+        </w:rPr>
+        <w:t>El origen de la duda. Al revisar el apartado de arquitectura surgió la pregunta de si «monolítico» y «monolito modular» son lo mismo. La confusión proviene de las listas de patrones que circulan: suelen enumerar «microservicios, monolítico, orientada a eventos y en capas» como si fueran alternativas del mismo tipo, cuando en realidad pertenecen a dos ejes distintos y por lo tanto pueden combinarse.</w:t>
+      </w:r>
+    </w:p>
+    <w:p>
+      <w:r>
+        <w:rPr>
+          <w:b w:val="0"/>
+          <w:sz w:val="22"/>
+        </w:rPr>
+        <w:t>Los dos ejes que no deben confundirse.</w:t>
+      </w:r>
+    </w:p>
+    <w:tbl>
+      <w:tblPr>
+        <w:tblStyle w:val="TableGrid"/>
+        <w:tblW w:type="auto" w:w="0"/>
+        <w:jc w:val="center"/>
+        <w:tblLook w:firstColumn="1" w:firstRow="1" w:lastColumn="0" w:lastRow="0" w:noHBand="0" w:noVBand="1" w:val="04A0"/>
+      </w:tblPr>
+      <w:tblGrid>
+        <w:gridCol w:w="2880"/>
+        <w:gridCol w:w="2880"/>
+        <w:gridCol w:w="2880"/>
+      </w:tblGrid>
+      <w:tr>
+        <w:tc>
+          <w:tcPr>
+            <w:tcW w:type="dxa" w:w="2880"/>
+          </w:tcPr>
+          <w:p>
+            <w:r>
+              <w:rPr>
+                <w:b/>
+                <w:sz w:val="20"/>
+              </w:rPr>
+              <w:t>Eje</w:t>
+            </w:r>
+          </w:p>
+        </w:tc>
+        <w:tc>
+          <w:tcPr>
+            <w:tcW w:type="dxa" w:w="2880"/>
+          </w:tcPr>
+          <w:p>
+            <w:r>
+              <w:rPr>
+                <w:b/>
+                <w:sz w:val="20"/>
+              </w:rPr>
+              <w:t>Pregunta que responde</w:t>
+            </w:r>
+          </w:p>
+        </w:tc>
+        <w:tc>
+          <w:tcPr>
+            <w:tcW w:type="dxa" w:w="2880"/>
+          </w:tcPr>
+          <w:p>
+            <w:r>
+              <w:rPr>
+                <w:b/>
+                <w:sz w:val="20"/>
+              </w:rPr>
+              <w:t>Patrones</w:t>
+            </w:r>
+          </w:p>
+        </w:tc>
+      </w:tr>
+      <w:tr>
+        <w:tc>
+          <w:tcPr>
+            <w:tcW w:type="dxa" w:w="2880"/>
+          </w:tcPr>
+          <w:p>
+            <w:r>
+              <w:rPr>
+                <w:b w:val="0"/>
+                <w:sz w:val="20"/>
+              </w:rPr>
+              <w:t>Despliegue (estructura)</w:t>
+            </w:r>
+          </w:p>
+        </w:tc>
+        <w:tc>
+          <w:tcPr>
+            <w:tcW w:type="dxa" w:w="2880"/>
+          </w:tcPr>
+          <w:p>
+            <w:r>
+              <w:rPr>
+                <w:b w:val="0"/>
+                <w:sz w:val="20"/>
+              </w:rPr>
+              <w:t>¿En cuántas unidades se despliega el sistema?</w:t>
+            </w:r>
+          </w:p>
+        </w:tc>
+        <w:tc>
+          <w:tcPr>
+            <w:tcW w:type="dxa" w:w="2880"/>
+          </w:tcPr>
+          <w:p>
+            <w:r>
+              <w:rPr>
+                <w:b w:val="0"/>
+                <w:sz w:val="20"/>
+              </w:rPr>
+              <w:t>Microservicios · Monolítico · Orientada a eventos</w:t>
+            </w:r>
+          </w:p>
+        </w:tc>
+      </w:tr>
+      <w:tr>
+        <w:tc>
+          <w:tcPr>
+            <w:tcW w:type="dxa" w:w="2880"/>
+          </w:tcPr>
+          <w:p>
+            <w:r>
+              <w:rPr>
+                <w:b w:val="0"/>
+                <w:sz w:val="20"/>
+              </w:rPr>
+              <w:t>Organización interna (código)</w:t>
+            </w:r>
+          </w:p>
+        </w:tc>
+        <w:tc>
+          <w:tcPr>
+            <w:tcW w:type="dxa" w:w="2880"/>
+          </w:tcPr>
+          <w:p>
+            <w:r>
+              <w:rPr>
+                <w:b w:val="0"/>
+                <w:sz w:val="20"/>
+              </w:rPr>
+              <w:t>¿Cómo se ordena el código por dentro?</w:t>
+            </w:r>
+          </w:p>
+        </w:tc>
+        <w:tc>
+          <w:tcPr>
+            <w:tcW w:type="dxa" w:w="2880"/>
+          </w:tcPr>
+          <w:p>
+            <w:r>
+              <w:rPr>
+                <w:b w:val="0"/>
+                <w:sz w:val="20"/>
+              </w:rPr>
+              <w:t>En capas (N-Tier) · Modular</w:t>
+            </w:r>
+          </w:p>
+        </w:tc>
+      </w:tr>
+    </w:tbl>
+    <w:p/>
+    <w:p>
+      <w:r>
+        <w:rPr>
+          <w:b w:val="0"/>
+          <w:sz w:val="22"/>
+        </w:rPr>
+        <w:t>Monolítico y monolito modular. «Monolítico» responde al primer eje: todo el sistema se construye y se despliega como una única unidad ✅. «Monolito modular» precisa el segundo: esa unidad única se organiza internamente en módulos con responsabilidad separada ✅. En consecuencia, todo monolito modular es un monolito, pero no todo monolito es modular: un monolito sin módulos definidos es lo que la industria llama una «bola de barro», donde cualquier cambio puede afectar partes no relacionadas. La palabra «modular», por tanto, no decora: distingue el sistema de ese caso.</w:t>
+      </w:r>
+    </w:p>
+    <w:p>
+      <w:r>
+        <w:rPr>
+          <w:b w:val="0"/>
+          <w:sz w:val="22"/>
+        </w:rPr>
+        <w:t>Cómo se aplica a SI.G.VA.CH.</w:t>
+      </w:r>
+    </w:p>
+    <w:p>
+      <w:pPr>
+        <w:pStyle w:val="ListBullet"/>
+      </w:pPr>
+      <w:r>
+        <w:rPr>
+          <w:b w:val="0"/>
+          <w:sz w:val="22"/>
+        </w:rPr>
+        <w:t>Despliegue: monolito modular ✅ — una sola unidad desplegable: un programa, un proceso, una dirección pública y una sola conexión con la base de datos, de modo que el cliente no distingue la estructura interna del servicio.</w:t>
+      </w:r>
+    </w:p>
+    <w:p>
+      <w:pPr>
+        <w:pStyle w:val="ListBullet"/>
+      </w:pPr>
+      <w:r>
+        <w:rPr>
+          <w:b w:val="0"/>
+          <w:sz w:val="22"/>
+        </w:rPr>
+        <w:t>Organización interna: arquitectura en capas ✅ — rutas/ (presentación, el contrato de la API), servicios/ y controladores (lógica de negocio y reglas del dominio), repositorios/ (acceso a datos, con una implementación en memoria y otra sobre Cloud Firestore), esquemas/ (validación de entradas) y seguridad/ (autorización por rol).</w:t>
+      </w:r>
+    </w:p>
+    <w:p>
+      <w:pPr>
+        <w:pStyle w:val="ListBullet"/>
+      </w:pPr>
+      <w:r>
+        <w:rPr>
+          <w:b w:val="0"/>
+          <w:sz w:val="22"/>
+        </w:rPr>
+        <w:t>Alternativas evaluadas y descartadas: microservicios y cómputo sin servidor, por el costo operativo que imponen frente al alcance del prototipo, con la recomendación de separar el servicio si el sistema crece.</w:t>
+      </w:r>
+    </w:p>
+    <w:p>
+      <w:r>
+        <w:rPr>
+          <w:b w:val="0"/>
+          <w:sz w:val="22"/>
+        </w:rPr>
+        <w:t>La precisión que se incorporó al documento. Conviene distinguir el servicio del sistema: el servicio es un monolito modular, mientras que el sistema en su conjunto es una solución distribuida, con el módulo de adquisición (ESP32), el servicio, los clientes —web y móvil— y la base de datos como componentes separados que se comunican por la red. Los «cuatro niveles» que menciona el apartado describen los componentes del sistema, no la estructura interna del servicio. Sin esta precisión, la pregunta «si es un monolito, ¿por qué habla de cuatro niveles?» queda abierta.</w:t>
+      </w:r>
+    </w:p>
+    <w:p>
+      <w:r>
+        <w:rPr>
+          <w:b w:val="0"/>
+          <w:sz w:val="22"/>
+        </w:rPr>
+        <w:t>La analogía adoptada para explicarlo. Un barrio de casas separadas se corresponde con los microservicios; una casa con habitaciones y paredes interiores, con el monolito modular —un solo edificio, pero con cada ambiente separado—; y una casa sin paredes interiores, con el monolito no modular. La comparación se conserva porque permite explicar la diferencia en una frase sin recurrir a terminología técnica.</w:t>
+      </w:r>
+    </w:p>
+    <w:p>
+      <w:r>
+        <w:rPr>
+          <w:b w:val="0"/>
+          <w:sz w:val="22"/>
+        </w:rPr>
+        <w:t>Redacción adoptada. «Patrón arquitectónico adoptado: monolito modular, variante del patrón monolítico en la que una única unidad desplegable se organiza internamente en módulos con responsabilidad separada, con organización en capas —presentación, lógica de negocio y datos—.»</w:t>
+      </w:r>
+    </w:p>
+    <w:p>
+      <w:r>
+        <w:rPr>
+          <w:b w:val="0"/>
+          <w:color w:val="555555"/>
+          <w:sz w:val="18"/>
+        </w:rPr>
+        <w:t>____________________________________________________________</w:t>
+      </w:r>
+    </w:p>
+    <w:p>
+      <w:r>
+        <w:rPr>
+          <w:b w:val="0"/>
+          <w:sz w:val="22"/>
+        </w:rPr>
+        <w:t>Bitácora de trabajo del Módulo 4. Elaborada al cierre de las sesiones del lunes 14, del martes 15, del miércoles 16, del jueves 17 y del viernes 18 de septiembre de 2026.</w:t>
       </w:r>
     </w:p>
     <w:sectPr>

</xml_diff>

<commit_message>
docs(bitacora): registrar la entrega del perfil de proyecto (E1)
Se deja constancia de la entrega: el entregable se reviso por completo antes de enviarlo —texto, catorce tablas y cinco figuras, con verificacion por huella digital de que las figuras fueran las vigentes— y se envio en el formato PDF que exige la plataforma, con el nombre que indica la plantilla, veintitres horas y cuarenta y cinco minutos antes del cierre, con el estado Enviado para calificar confirmado.
</commit_message>
<xml_diff>
--- a/docs/BITACORA_MARTES_2026-09-15.docx
+++ b/docs/BITACORA_MARTES_2026-09-15.docx
@@ -5894,6 +5894,15 @@
       <w:r>
         <w:rPr>
           <w:b w:val="0"/>
+          <w:sz w:val="22"/>
+        </w:rPr>
+        <w:t>Entrega del perfil de proyecto (E1). El entregable se revisó por completo antes de enviarlo: se auditó el texto, las catorce tablas y las cinco figuras, se comprobó por huella digital que las figuras insertadas fueran las vigentes del proyecto y se verificó que no quedaran marcadores ni avisos de revisión en el cuerpo. El diagrama de casos de uso se rehízo en Enterprise Architect. La entrega se realizó en el formato que exige la plataforma —PDF— y con el nombre que indica la plantilla, Santos_Perfil_Proyecto_v1, 23 horas y 45 minutos antes del cierre, con el estado «Enviado para calificar» confirmado. El documento editable y su PDF quedan versionados en docs/ del repositorio, junto con los programas que generan las figuras y el que completa la plantilla, de modo que el entregable sea reproducible.</w:t>
+      </w:r>
+    </w:p>
+    <w:p>
+      <w:r>
+        <w:rPr>
+          <w:b w:val="0"/>
           <w:color w:val="555555"/>
           <w:sz w:val="18"/>
         </w:rPr>

</xml_diff>